<commit_message>
Actualizar informe final de Semana 4
Actualiza las versiones DOCX y PDF del informe final e incorpora el enlace público del repositorio en la documentación del entregable.
</commit_message>
<xml_diff>
--- a/Semana4/informe/MCDI504_S4_2_GRUPO6.docx
+++ b/Semana4/informe/MCDI504_S4_2_GRUPO6.docx
@@ -175,7 +175,7 @@
           <w:i/>
           <w:sz w:val="22"/>
         </w:rPr>
-        <w:t>Repositorio: mcdi504-machine-learning-1 (enlace público a adjuntar en Canvas tras la publicación)</w:t>
+        <w:t>Repositorio: https://github.com/edocontreras/mcdi504-machine-learning-1</w:t>
       </w:r>
     </w:p>
     <w:p>
@@ -4897,7 +4897,7 @@
           <w:i w:val="0"/>
           <w:sz w:val="22"/>
         </w:rPr>
-        <w:t>Repositorio del proyecto: `mcdi504-machine-learning-1`. La URL pública debe adjuntarse en Canvas una vez publicado el repositorio; no se incorpora una URL inventada en este documento.</w:t>
+        <w:t>Repositorio del proyecto: https://github.com/edocontreras/mcdi504-machine-learning-1. El enlace corresponde a la versión pública del repositorio utilizada para la entrega y permite verificar la trazabilidad entre notebook, resultados, figuras e informe.</w:t>
       </w:r>
     </w:p>
     <w:p>

</xml_diff>